<commit_message>
Restore the three protocol passages that already recorded the rename.
The name pass had rewritten the draft-name line, the struck 29 October question and the 29 October note in protocol version 0.6.1. Those passages are back as they read in the backups, with one dated note under the 29 October note. The change note dates the two new lines and strikes "Third." The grants README records that the NIHR outline PDFs still print the old name.

Co-authored-by: VSaraMcNeillis <VSaraMcNeillis@users.noreply.github.com>
</commit_message>
<xml_diff>
--- a/lazoo-company-name-2026-10-30/lazoo-cmf/03-studies/LAZ-VAL-001/Lazoo protocol v0.6.1 2026-10-30.docx
+++ b/lazoo-company-name-2026-10-30/lazoo-cmf/03-studies/LAZ-VAL-001/Lazoo protocol v0.6.1 2026-10-30.docx
@@ -198,63 +198,16 @@
           <w:sz w:val="22"/>
           <w:lang w:val="en-GB" w:eastAsia="en-GB"/>
         </w:rPr>
-        <w:t xml:space="preserve">formerly </w:t>
-      </w:r>
-      <w:r>
-        <w:rPr>
-          <w:rFonts w:ascii="Calibri" w:hAnsi="Calibri" w:cs="Calibri" w:eastAsia="Calibri"/>
-          <w:strike/>
+        <w:t>formerly App Ltd</w:t>
+      </w:r>
+      <w:r>
+        <w:rPr>
+          <w:rFonts w:ascii="Calibri" w:hAnsi="Calibri" w:cs="Calibri" w:eastAsia="Calibri"/>
           <w:color w:val="1A1A1A"/>
           <w:sz w:val="22"/>
           <w:lang w:val="en-GB" w:eastAsia="en-GB"/>
         </w:rPr>
-        <w:t>App Ltd</w:t>
-      </w:r>
-      <w:r>
-        <w:rPr>
-          <w:rFonts w:ascii="Calibri" w:hAnsi="Calibri" w:cs="Calibri" w:eastAsia="Calibri"/>
-          <w:color w:val="1A1A1A"/>
-          <w:sz w:val="22"/>
-          <w:lang w:val="en-GB" w:eastAsia="en-GB"/>
-        </w:rPr>
-        <w:t xml:space="preserve"> SHC Sleep Solutions Limited (short form for company number 12467350, renamed 27 October 2026)</w:t>
-      </w:r>
-      <w:r>
-        <w:rPr>
-          <w:rFonts w:ascii="Calibri" w:hAnsi="Calibri" w:cs="Calibri" w:eastAsia="Calibri"/>
-          <w:color w:val="1A1A1A"/>
-          <w:sz w:val="22"/>
-          <w:lang w:val="en-GB" w:eastAsia="en-GB"/>
-        </w:rPr>
-        <w:t xml:space="preserve"> formerly </w:t>
-      </w:r>
-      <w:r>
-        <w:rPr>
-          <w:rFonts w:ascii="Calibri" w:hAnsi="Calibri" w:cs="Calibri" w:eastAsia="Calibri"/>
-          <w:color w:val="1A1A1A"/>
-          <w:sz w:val="22"/>
-          <w:lang w:val="en-GB" w:eastAsia="en-GB"/>
-          <w:strike/>
-        </w:rPr>
-        <w:t>Sleep and Health Clinic App Ltd</w:t>
-      </w:r>
-      <w:r>
-        <w:rPr>
-          <w:rFonts w:ascii="Calibri" w:hAnsi="Calibri" w:cs="Calibri" w:eastAsia="Calibri"/>
-          <w:color w:val="1A1A1A"/>
-          <w:sz w:val="22"/>
-          <w:lang w:val="en-GB" w:eastAsia="en-GB"/>
-        </w:rPr>
-        <w:t xml:space="preserve"> SHC Sleep Solutions Limited</w:t>
-      </w:r>
-      <w:r>
-        <w:rPr>
-          <w:rFonts w:ascii="Calibri" w:hAnsi="Calibri" w:cs="Calibri" w:eastAsia="Calibri"/>
-          <w:color w:val="1A1A1A"/>
-          <w:sz w:val="22"/>
-          <w:lang w:val="en-GB" w:eastAsia="en-GB"/>
-        </w:rPr>
-        <w:t xml:space="preserve"> (name changed 27 October 2026).</w:t>
+        <w:t xml:space="preserve"> formerly Sleep and Health Clinic App Ltd (name changed 27 October 2026).</w:t>
       </w:r>
     </w:p>
     <w:p>
@@ -785,101 +738,21 @@
           <w:sz w:val="22"/>
           <w:lang w:val="en-GB" w:eastAsia="en-GB"/>
         </w:rPr>
-        <w:t xml:space="preserve">Whether the registered name in the protocol should change from </w:t>
-      </w:r>
-      <w:r>
-        <w:rPr>
-          <w:rFonts w:ascii="Calibri" w:hAnsi="Calibri" w:cs="Calibri" w:eastAsia="Calibri"/>
-          <w:strike/>
+        <w:t>Whether the registered name in the protocol should change from Sleep and Health Clinic App Ltd to SHC Sleep Solutions Ltd, for the same company number, is open. No such decision appears in the intended-purpose amendment or the classification review, so the proposed passages keep the name used in version 0.5.</w:t>
+      </w:r>
+      <w:r>
+        <w:rPr>
+          <w:rFonts w:ascii="Calibri" w:hAnsi="Calibri" w:cs="Calibri" w:eastAsia="Calibri"/>
           <w:color w:val="1A1A1A"/>
           <w:sz w:val="22"/>
           <w:lang w:val="en-GB" w:eastAsia="en-GB"/>
         </w:rPr>
-        <w:t>Sleep and Health Clinic App Ltd</w:t>
-      </w:r>
-      <w:r>
-        <w:rPr>
-          <w:rFonts w:ascii="Calibri" w:hAnsi="Calibri" w:cs="Calibri" w:eastAsia="Calibri"/>
-          <w:color w:val="1A1A1A"/>
-          <w:sz w:val="22"/>
-          <w:lang w:val="en-GB" w:eastAsia="en-GB"/>
-        </w:rPr>
-        <w:t xml:space="preserve"> SHC Sleep Solutions Limited</w:t>
-      </w:r>
-      <w:r>
-        <w:rPr>
-          <w:rFonts w:ascii="Calibri" w:hAnsi="Calibri" w:cs="Calibri" w:eastAsia="Calibri"/>
-          <w:strike/>
-          <w:color w:val="1A1A1A"/>
-          <w:sz w:val="22"/>
-          <w:lang w:val="en-GB" w:eastAsia="en-GB"/>
-        </w:rPr>
-        <w:t xml:space="preserve"> to SHC Sleep Solutions Ltd, for the same company number, is open. No such decision appears in the intended-purpose amendment or the classification review, so the proposed passages keep the name used in version 0.5.</w:t>
-      </w:r>
-      <w:r>
-        <w:rPr>
-          <w:rFonts w:ascii="Calibri" w:hAnsi="Calibri" w:cs="Calibri" w:eastAsia="Calibri"/>
-          <w:color w:val="1A1A1A"/>
-          <w:sz w:val="22"/>
-          <w:lang w:val="en-GB" w:eastAsia="en-GB"/>
-        </w:rPr>
-        <w:t xml:space="preserve"> Dated note, 29 October 2026: company 12467350 changed its registered name from </w:t>
-      </w:r>
-      <w:r>
-        <w:rPr>
-          <w:rFonts w:ascii="Calibri" w:hAnsi="Calibri" w:cs="Calibri" w:eastAsia="Calibri"/>
-          <w:color w:val="1A1A1A"/>
-          <w:sz w:val="22"/>
-          <w:lang w:val="en-GB" w:eastAsia="en-GB"/>
-          <w:strike/>
-        </w:rPr>
-        <w:t xml:space="preserve">Sleep and Health Clinic App Ltd</w:t>
-      </w:r>
-      <w:r>
-        <w:rPr>
-          <w:rFonts w:ascii="Calibri" w:hAnsi="Calibri" w:cs="Calibri" w:eastAsia="Calibri"/>
-          <w:color w:val="1A1A1A"/>
-          <w:sz w:val="22"/>
-          <w:lang w:val="en-GB" w:eastAsia="en-GB"/>
-        </w:rPr>
-        <w:t xml:space="preserve"> SHC Sleep Solutions Limited</w:t>
-      </w:r>
-      <w:r>
-        <w:rPr>
-          <w:rFonts w:ascii="Calibri" w:hAnsi="Calibri" w:cs="Calibri" w:eastAsia="Calibri"/>
-          <w:color w:val="1A1A1A"/>
-          <w:sz w:val="22"/>
-          <w:lang w:val="en-GB" w:eastAsia="en-GB"/>
-        </w:rPr>
-        <w:t xml:space="preserve"> to SHC Sleep Solutions Ltd on 27 October 2026. The sponsor is the same company. In this draft, the name </w:t>
-      </w:r>
-      <w:r>
-        <w:rPr>
-          <w:rFonts w:ascii="Calibri" w:hAnsi="Calibri" w:cs="Calibri" w:eastAsia="Calibri"/>
-          <w:color w:val="1A1A1A"/>
-          <w:sz w:val="22"/>
-          <w:lang w:val="en-GB" w:eastAsia="en-GB"/>
-          <w:strike/>
-        </w:rPr>
-        <w:t>Sleep and Health Clinic App Ltd</w:t>
-      </w:r>
-      <w:r>
-        <w:rPr>
-          <w:rFonts w:ascii="Calibri" w:hAnsi="Calibri" w:cs="Calibri" w:eastAsia="Calibri"/>
-          <w:color w:val="1A1A1A"/>
-          <w:sz w:val="22"/>
-          <w:lang w:val="en-GB" w:eastAsia="en-GB"/>
-        </w:rPr>
-        <w:t xml:space="preserve"> SHC Sleep Solutions Limited</w:t>
-      </w:r>
-      <w:r>
-        <w:rPr>
-          <w:rFonts w:ascii="Calibri" w:hAnsi="Calibri" w:cs="Calibri" w:eastAsia="Calibri"/>
-          <w:color w:val="1A1A1A"/>
-          <w:sz w:val="22"/>
-          <w:lang w:val="en-GB" w:eastAsia="en-GB"/>
-        </w:rPr>
-        <w:t xml:space="preserve"> in quoted version 0.5 text refers to SHC Sleep Solutions Ltd.</w:t>
+        <w:t xml:space="preserve"> Dated note, 29 October 2026: company 12467350 changed its registered name from Sleep and Health Clinic App Ltd to SHC Sleep Solutions Ltd on 27 October 2026. The sponsor is the same company. In this draft, the name Sleep and Health Clinic App Ltd in quoted version 0.5 text refers to SHC Sleep Solutions Ltd.</w:t>
+      </w:r>
+    </w:p>
+    <w:p>
+      <w:r>
+        <w:t>Dated note, 30 October 2026: the two lines above already record that company 12467350 was renamed SHC Sleep Solutions Limited on 27 October 2026. Their earlier name is kept as written.</w:t>
       </w:r>
     </w:p>
     <w:p>

</xml_diff>